<commit_message>
v1.2: bo muc phu kien khoi giai trinh tung thiet bi theo chi dao; cap nhat docx
Co-authored-by: arena-agent <297053741+arena-agent@users.noreply.github.com>
</commit_message>
<xml_diff>
--- a/Bao-cao-giai-trinh-mua-sam-phan-bo-thiet-bi.docx
+++ b/Bao-cao-giai-trinh-mua-sam-phan-bo-thiet-bi.docx
@@ -471,16 +471,16 @@
         <w:t>Phụ kiện – vật tư đi kèm:</w:t>
       </w:r>
       <w:r>
-        <w:t xml:space="preserve"> ghi nhận trong giải trình từng thiết bị (Mục III) dưới dạng phụ kiện kèm theo thiết bị và trang bị sẵn có của PTN; theo chỉ đạo, </w:t>
+        <w:t xml:space="preserve"> theo chỉ đạo của đơn vị, báo cáo </w:t>
       </w:r>
       <w:r>
         <w:rPr>
           <w:b/>
         </w:rPr>
-        <w:t>không đề xuất mua bổ sung phụ kiện ngoài 13 danh mục</w:t>
+        <w:t>không trình bày riêng mục phụ kiện</w:t>
       </w:r>
       <w:r>
-        <w:t xml:space="preserve"> và không tách phụ lục riêng.</w:t>
+        <w:t xml:space="preserve"> trong giải trình từng thiết bị; tình trạng sẵn có của trang bị hỗ trợ vận hành (bơm chân không, nguồn 24 V DC) được ghi nhận một lần tại Mục VI.2.</w:t>
       </w:r>
     </w:p>
     <w:p>
@@ -1530,20 +1530,6 @@
         <w:rPr>
           <w:b/>
         </w:rPr>
-        <w:t>Phụ kiện &amp; vật tư đi kèm:</w:t>
-      </w:r>
-      <w:r>
-        <w:t xml:space="preserve"> kèm theo thiết bị: phần mềm điều khiển Ossila trên PC, cáp USB/LAN; sử dụng chung PC trạm đo, thảm chống tĩnh điện, đầu dò/đế gá mẫu hiện có của PTN. Không phát sinh mua bổ sung.</w:t>
-      </w:r>
-    </w:p>
-    <w:p>
-      <w:pPr>
-        <w:pStyle w:val="ListBullet"/>
-      </w:pPr>
-      <w:r>
-        <w:rPr>
-          <w:b/>
-        </w:rPr>
         <w:t>Trình bày lý do (điền bảng):</w:t>
       </w:r>
       <w:r>
@@ -1669,29 +1655,6 @@
         <w:rPr>
           <w:b/>
         </w:rPr>
-        <w:t>Phụ kiện &amp; vật tư đi kèm:</w:t>
-      </w:r>
-      <w:r>
-        <w:t xml:space="preserve"> kèm theo thiết bị: bàn mẫu tới 6 inch, đầu dò lò xo lực không đổi 60 g, phần mềm và cáp kết nối; </w:t>
-      </w:r>
-      <w:r>
-        <w:rPr>
-          <w:b/>
-        </w:rPr>
-        <w:t>nguồn 24 V DC đã sẵn có tại PTN</w:t>
-      </w:r>
-      <w:r>
-        <w:t xml:space="preserve"> (xác nhận 23/9/2026). Không phát sinh mua bổ sung.</w:t>
-      </w:r>
-    </w:p>
-    <w:p>
-      <w:pPr>
-        <w:pStyle w:val="ListBullet"/>
-      </w:pPr>
-      <w:r>
-        <w:rPr>
-          <w:b/>
-        </w:rPr>
         <w:t>Trình bày lý do (điền bảng):</w:t>
       </w:r>
       <w:r>
@@ -1784,20 +1747,6 @@
       </w:r>
       <w:r>
         <w:t xml:space="preserve"> nối trực tiếp cổng USB máy tính tới chuẩn IEEE-488 (GPIB), điều khiển tối đa 14 thiết bị/dải, tốc độ &gt;1,15 MB/s, plug-and-play không cần card GPIB nội bộ; là "cầu nối" bắt buộc để khai thác các thiết bị chuẩn công nghiệp (Keithley 6221/2182A có GPIB) trong dạy thực hành đo lường tự động.</w:t>
-      </w:r>
-    </w:p>
-    <w:p>
-      <w:pPr>
-        <w:pStyle w:val="ListBullet"/>
-      </w:pPr>
-      <w:r>
-        <w:rPr>
-          <w:b/>
-        </w:rPr>
-        <w:t>Phụ kiện &amp; vật tư đi kèm:</w:t>
-      </w:r>
-      <w:r>
-        <w:t xml:space="preserve"> phần mềm Keysight IO Libraries Suite tải miễn phí từ hãng; cáp GPIB nối chuỗi và PC cổng USB dùng chung trang bị hiện có của PTN. Không phát sinh mua bổ sung.</w:t>
       </w:r>
     </w:p>
     <w:p>
@@ -1933,20 +1882,6 @@
         <w:rPr>
           <w:b/>
         </w:rPr>
-        <w:t>Phụ kiện &amp; vật tư đi kèm:</w:t>
-      </w:r>
-      <w:r>
-        <w:t xml:space="preserve"> kèm theo bộ: Nanovoltmeter 2182A và cáp Trigger Link đồng bộ; cáp triaxial (Mục 5), bộ chuyển GPIB–USB (Mục 3), hộp chắn nhiễu nằm trong cùng danh mục/hiện có của PTN. Không phát sinh mua bổ sung.</w:t>
-      </w:r>
-    </w:p>
-    <w:p>
-      <w:pPr>
-        <w:pStyle w:val="ListBullet"/>
-      </w:pPr>
-      <w:r>
-        <w:rPr>
-          <w:b/>
-        </w:rPr>
         <w:t>Trình bày lý do (điền bảng):</w:t>
       </w:r>
       <w:r>
@@ -2010,20 +1945,6 @@
       </w:r>
       <w:r>
         <w:t xml:space="preserve"> cấu trúc trục ba có lớp guard triệt tiêu dòng rò và nhiễu điện dung, bảo đảm phép đo 10 nA–200 mA và nV của Mục 1/Mục 4 đạt đúng độ phân giải công bố; điện trở cách điện 10¹⁵ Ω; đầu kẹp cá sấu thuận tiện gá mẫu trong bài thực hành.</w:t>
-      </w:r>
-    </w:p>
-    <w:p>
-      <w:pPr>
-        <w:pStyle w:val="ListBullet"/>
-      </w:pPr>
-      <w:r>
-        <w:rPr>
-          <w:b/>
-        </w:rPr>
-        <w:t>Phụ kiện &amp; vật tư đi kèm:</w:t>
-      </w:r>
-      <w:r>
-        <w:t xml:space="preserve"> đầu kẹp cá sấu kèm theo cáp; không cần phần mềm hay phụ kiện mua thêm.</w:t>
       </w:r>
     </w:p>
     <w:p>
@@ -2150,29 +2071,6 @@
         <w:rPr>
           <w:b/>
         </w:rPr>
-        <w:t>Phụ kiện &amp; vật tư đi kèm:</w:t>
-      </w:r>
-      <w:r>
-        <w:t xml:space="preserve"> kèm theo máy: 2 khay nhôm, bộ điều khiển cảm ứng TFT LCD 4"; </w:t>
-      </w:r>
-      <w:r>
-        <w:rPr>
-          <w:b/>
-        </w:rPr>
-        <w:t>bơm chân không đã sẵn có tại PTN</w:t>
-      </w:r>
-      <w:r>
-        <w:t xml:space="preserve"> (xác nhận 23/9/2026). Không phát sinh mua bổ sung.</w:t>
-      </w:r>
-    </w:p>
-    <w:p>
-      <w:pPr>
-        <w:pStyle w:val="ListBullet"/>
-      </w:pPr>
-      <w:r>
-        <w:rPr>
-          <w:b/>
-        </w:rPr>
         <w:t>Trình bày lý do (điền bảng):</w:t>
       </w:r>
       <w:r>
@@ -2289,20 +2187,6 @@
         <w:rPr>
           <w:b/>
         </w:rPr>
-        <w:t>Phụ kiện &amp; vật tư đi kèm:</w:t>
-      </w:r>
-      <w:r>
-        <w:t xml:space="preserve"> cảm biến nguyên khối kèm tài liệu hãng; mạch đọc/DAQ và buồng thử khí dùng chung trang bị hiện có của PTN. Không phát sinh mua bổ sung.</w:t>
-      </w:r>
-    </w:p>
-    <w:p>
-      <w:pPr>
-        <w:pStyle w:val="ListBullet"/>
-      </w:pPr>
-      <w:r>
-        <w:rPr>
-          <w:b/>
-        </w:rPr>
         <w:t>Trình bày lý do (điền bảng):</w:t>
       </w:r>
       <w:r>
@@ -2395,20 +2279,6 @@
       </w:r>
       <w:r>
         <w:t xml:space="preserve"> đo VOC có thế ion hóa &lt; 10,6 eV (benzene, toluene, isobutylene…) với dải động rộng 100 ppb–4.000 ppm, đáp ứng 2 s – bổ sung dải đo cao mà cảm biến điện hóa Mục 7 không phủ hết; minh họa ứng dụng nguồn UV trong phân tích khí.</w:t>
-      </w:r>
-    </w:p>
-    <w:p>
-      <w:pPr>
-        <w:pStyle w:val="ListBullet"/>
-      </w:pPr>
-      <w:r>
-        <w:rPr>
-          <w:b/>
-        </w:rPr>
-        <w:t>Phụ kiện &amp; vật tư đi kèm:</w:t>
-      </w:r>
-      <w:r>
-        <w:t xml:space="preserve"> đèn UV 10,6 eV lắp sẵn trong cảm biến; mạch đọc/DAQ và buồng thử khí dùng chung trang bị hiện có của PTN. Không phát sinh mua bổ sung.</w:t>
       </w:r>
     </w:p>
     <w:p>
@@ -2535,20 +2405,6 @@
         <w:rPr>
           <w:b/>
         </w:rPr>
-        <w:t>Phụ kiện &amp; vật tư đi kèm:</w:t>
-      </w:r>
-      <w:r>
-        <w:t xml:space="preserve"> kèm theo máy: buồng chắn gió, đĩa cân Ø80 mm, adapter nguồn; bàn cân và quả chuẩn dùng theo hiện trạng PTN. Không phát sinh mua bổ sung.</w:t>
-      </w:r>
-    </w:p>
-    <w:p>
-      <w:pPr>
-        <w:pStyle w:val="ListBullet"/>
-      </w:pPr>
-      <w:r>
-        <w:rPr>
-          <w:b/>
-        </w:rPr>
         <w:t>Trình bày lý do (điền bảng):</w:t>
       </w:r>
       <w:r>
@@ -2655,29 +2511,6 @@
       </w:r>
       <w:r>
         <w:t xml:space="preserve"> hai vùng gia nhiệt độc lập tạo profile nhiệt phẳng (±1 °C trên 50 mm) hoặc gradient có kiểm soát – điều kiện chuẩn của khuếch tán nhiệt và CVD; mặt bích chân không + đường khí 1/4" cho phép chạy khí bảo vệ/khí phản ứng và hút chân không trước khi nung.</w:t>
-      </w:r>
-    </w:p>
-    <w:p>
-      <w:pPr>
-        <w:pStyle w:val="ListBullet"/>
-      </w:pPr>
-      <w:r>
-        <w:rPr>
-          <w:b/>
-        </w:rPr>
-        <w:t>Phụ kiện &amp; vật tư đi kèm:</w:t>
-      </w:r>
-      <w:r>
-        <w:t xml:space="preserve"> kèm theo máy: mặt bích thép không gỉ làm kín chân không, khối chặn ống sợi gốm, van chân không SS, ống thạch anh 1"/2"; </w:t>
-      </w:r>
-      <w:r>
-        <w:rPr>
-          <w:b/>
-        </w:rPr>
-        <w:t>bơm chân không dùng chung trang bị hiện có của PTN</w:t>
-      </w:r>
-      <w:r>
-        <w:t xml:space="preserve"> (xác nhận 23/9/2026); lưu lượng khí giám sát bằng lưu lượng kế Mục 13 trong cùng danh mục. Không phát sinh mua bổ sung.</w:t>
       </w:r>
     </w:p>
     <w:p>
@@ -2804,29 +2637,6 @@
         <w:rPr>
           <w:b/>
         </w:rPr>
-        <w:t>Phụ kiện &amp; vật tư đi kèm:</w:t>
-      </w:r>
-      <w:r>
-        <w:t xml:space="preserve"> kèm theo máy: ống alumina, mặt bích SS304, cặp nhiệt loại S; </w:t>
-      </w:r>
-      <w:r>
-        <w:rPr>
-          <w:b/>
-        </w:rPr>
-        <w:t>bơm chân không dùng chung trang bị hiện có của PTN</w:t>
-      </w:r>
-      <w:r>
-        <w:t xml:space="preserve"> (xác nhận 23/9/2026); lưu lượng khí giám sát bằng lưu lượng kế Mục 13 trong cùng danh mục. Không phát sinh mua bổ sung.</w:t>
-      </w:r>
-    </w:p>
-    <w:p>
-      <w:pPr>
-        <w:pStyle w:val="ListBullet"/>
-      </w:pPr>
-      <w:r>
-        <w:rPr>
-          <w:b/>
-        </w:rPr>
         <w:t>Trình bày lý do (điền bảng):</w:t>
       </w:r>
       <w:r>
@@ -2943,20 +2753,6 @@
         <w:rPr>
           <w:b/>
         </w:rPr>
-        <w:t>Phụ kiện &amp; vật tư đi kèm:</w:t>
-      </w:r>
-      <w:r>
-        <w:t xml:space="preserve"> kèm theo máy: bộ nguồn MeanWell chế độ dòng không đổi, kính thạch anh hội tụ, bộ hẹn giờ kỹ thuật số; thiết bị vận hành độc lập, không phát sinh mua bổ sung.</w:t>
-      </w:r>
-    </w:p>
-    <w:p>
-      <w:pPr>
-        <w:pStyle w:val="ListBullet"/>
-      </w:pPr>
-      <w:r>
-        <w:rPr>
-          <w:b/>
-        </w:rPr>
         <w:t>Trình bày lý do (điền bảng):</w:t>
       </w:r>
       <w:r>
@@ -3049,20 +2845,6 @@
       </w:r>
       <w:r>
         <w:t xml:space="preserve"> đo lưu lượng 0–100 sccm với sai số ±(1,5 % RD + 0,15 % FS), đáp ứng 2 ms, xuất tín hiệu số I2C và analog – đủ để vừa làm thiết bị đo dạy học vừa làm cảm biến phản hồi trong mạch điều khiển khí công nghệ; dải 100 sccm khớp lưu lượng khí điển hình của lò ống phòng lab (Mục 10, 11).</w:t>
-      </w:r>
-    </w:p>
-    <w:p>
-      <w:pPr>
-        <w:pStyle w:val="ListBullet"/>
-      </w:pPr>
-      <w:r>
-        <w:rPr>
-          <w:b/>
-        </w:rPr>
-        <w:t>Phụ kiện &amp; vật tư đi kèm:</w:t>
-      </w:r>
-      <w:r>
-        <w:t xml:space="preserve"> kèm theo cảm biến: cáp tín hiệu chuẩn hãng; ghép chung tuyến ống khí hiện có của lò ống (Mục 10–11); đọc tín hiệu bằng DAQ/PC hiện có của PTN. Không phát sinh mua bổ sung.</w:t>
       </w:r>
     </w:p>
     <w:p>

</xml_diff>